<commit_message>
Update assessment report with project links
</commit_message>
<xml_diff>
--- a/PlacidWay_Chatbot_Assessment_Sunil_Ghanchi.docx
+++ b/PlacidWay_Chatbot_Assessment_Sunil_Ghanchi.docx
@@ -18,7 +18,7 @@
           <w:sz w:val="18"/>
           <w:szCs w:val="18"/>
         </w:rPr>
-        <w:t xml:space="preserve">GROUNDED CARE GUIDE</w:t>
+        <w:t xml:space="preserve">PLACIDWAY BOT</w:t>
       </w:r>
     </w:p>
     <w:p>
@@ -31,7 +31,7 @@
     </w:p>
     <w:p>
       <w:pPr>
-        <w:spacing w:after="280"/>
+        <w:spacing w:after="70"/>
       </w:pPr>
       <w:r>
         <w:rPr>
@@ -41,6 +41,11 @@
         </w:rPr>
         <w:t xml:space="preserve">AI Automation Engineer assessment submission</w:t>
       </w:r>
+    </w:p>
+    <w:p>
+      <w:pPr>
+        <w:spacing w:after="280"/>
+      </w:pPr>
       <w:r>
         <w:rPr>
           <w:b/>
@@ -49,14 +54,13 @@
           <w:sz w:val="20"/>
           <w:szCs w:val="20"/>
         </w:rPr>
-        <w:t xml:space="preserve">
-Sunil Ghanchi  ·  October 26, 2026</w:t>
+        <w:t xml:space="preserve">Sunil Ghanchi  ·  October 26, 2026</w:t>
       </w:r>
     </w:p>
     <w:p>
       <w:pPr>
         <w:shd w:fill="E8F4F1" w:val="clear"/>
-        <w:spacing w:after="300" w:before="180"/>
+        <w:spacing w:after="80" w:before="180"/>
         <w:ind w:left="220" w:right="220"/>
       </w:pPr>
       <w:r>
@@ -69,7 +73,7 @@
         </w:rPr>
         <w:t xml:space="preserve">Live demo  </w:t>
       </w:r>
-      <w:hyperlink w:history="1" r:id="rIdgpro0o8qw8nggspfxtkhx">
+      <w:hyperlink w:history="1" r:id="rIdh0d5x5zx8cprzalyvhobf">
         <w:r>
           <w:rPr>
             <w:b/>
@@ -77,12 +81,40 @@
             <w:color w:val="087C78"/>
             <w:u w:val="single"/>
           </w:rPr>
-          <w:t xml:space="preserve">placidway-grounded-chatbot.starrysiren6.chatgpt.site</w:t>
+          <w:t xml:space="preserve">placidway-bot.vercel.app</w:t>
         </w:r>
       </w:hyperlink>
     </w:p>
     <w:p>
       <w:pPr>
+        <w:shd w:fill="E8F4F1" w:val="clear"/>
+        <w:spacing w:after="300"/>
+        <w:ind w:left="220" w:right="220"/>
+      </w:pPr>
+      <w:r>
+        <w:rPr>
+          <w:b/>
+          <w:bCs/>
+          <w:color w:val="0B2A33"/>
+          <w:sz w:val="22"/>
+          <w:szCs w:val="22"/>
+        </w:rPr>
+        <w:t xml:space="preserve">GitHub  </w:t>
+      </w:r>
+      <w:hyperlink w:history="1" r:id="rIdwewapkattacmpzw-ttwce">
+        <w:r>
+          <w:rPr>
+            <w:b/>
+            <w:bCs/>
+            <w:color w:val="087C78"/>
+            <w:u w:val="single"/>
+          </w:rPr>
+          <w:t xml:space="preserve">github.com/sunilghanchi/placidway-bot</w:t>
+        </w:r>
+      </w:hyperlink>
+    </w:p>
+    <w:p>
+      <w:pPr>
         <w:spacing w:after="150" w:line="300"/>
       </w:pPr>
       <w:r>
@@ -91,7 +123,7 @@
           <w:sz w:val="21"/>
           <w:szCs w:val="21"/>
         </w:rPr>
-        <w:t xml:space="preserve">A small, deterministic chatbot that answers from only the seven approved PlacidWay pages. It cites every factual answer, preserves price context, refuses medical advice, and clearly says when evidence is missing.</w:t>
+        <w:t xml:space="preserve">A full-stack retrieval-augmented generation chatbot that answers from only the seven approved PlacidWay pages. It retrieves source chunks with FAISS, generates evidence-bound answers with Gemini, preserves price context, refuses individualized medical advice, and clearly says when evidence is missing.</w:t>
       </w:r>
     </w:p>
     <w:p>
@@ -113,7 +145,7 @@
           <w:sz w:val="21"/>
           <w:szCs w:val="21"/>
         </w:rPr>
-        <w:t xml:space="preserve">I used buildless HTML, CSS, and JavaScript with a curated JSON knowledge base and deterministic retrieval. For a seven-page medical-information corpus, this design is easier to inspect and less likely to invent a price or medical claim than an unconstrained generative model. It also has no runtime API cost or secret keys.</w:t>
+        <w:t xml:space="preserve">I used FastAPI for the backend, Gemini 3.5 Flash-Lite for answer generation, Gemini Embedding 2 at 768 dimensions for retrieval embeddings, FAISS IndexFlatIP as the free local vector database, and buildless HTML, CSS, and JavaScript for the single-page interface. This stack stays within free-tier services while keeping the retrieval and safety pipeline inspectable.</w:t>
       </w:r>
     </w:p>
     <w:p>
@@ -158,7 +190,25 @@
           <w:sz w:val="20"/>
           <w:szCs w:val="20"/>
         </w:rPr>
-        <w:t xml:space="preserve">Seven-source allowlist, clickable citations, and a visible evidence trail</w:t>
+        <w:t xml:space="preserve">Seven-source allowlist with chunk-level retrieval and in-page citation popups</w:t>
+      </w:r>
+    </w:p>
+    <w:p>
+      <w:pPr>
+        <w:pStyle w:val="ListParagraph"/>
+        <w:numPr>
+          <w:ilvl w:val="0"/>
+          <w:numId w:val="2"/>
+        </w:numPr>
+        <w:spacing w:after="90" w:line="280"/>
+      </w:pPr>
+      <w:r>
+        <w:rPr>
+          <w:color w:val="0B2A33"/>
+          <w:sz w:val="20"/>
+          <w:szCs w:val="20"/>
+        </w:rPr>
+        <w:t xml:space="preserve">Gemini generation constrained to retrieved evidence and validated before display</w:t>
       </w:r>
     </w:p>
     <w:p>
@@ -194,25 +244,7 @@
           <w:sz w:val="20"/>
           <w:szCs w:val="20"/>
         </w:rPr>
-        <w:t xml:space="preserve">Refresh ingestion script with a clear User-Agent and 1.1-second request spacing</w:t>
-      </w:r>
-    </w:p>
-    <w:p>
-      <w:pPr>
-        <w:pStyle w:val="ListParagraph"/>
-        <w:numPr>
-          <w:ilvl w:val="0"/>
-          <w:numId w:val="2"/>
-        </w:numPr>
-        <w:spacing w:after="90" w:line="280"/>
-      </w:pPr>
-      <w:r>
-        <w:rPr>
-          <w:color w:val="0B2A33"/>
-          <w:sz w:val="20"/>
-          <w:szCs w:val="20"/>
-        </w:rPr>
-        <w:t xml:space="preserve">Follow-up topic memory and browser-local logging for unanswered questions</w:t>
+        <w:t xml:space="preserve">GitHub source repository and verified Vercel production deployment</w:t>
       </w:r>
     </w:p>
     <w:p>
@@ -252,79 +284,115 @@
           <w:sz w:val="20"/>
           <w:szCs w:val="20"/>
         </w:rPr>
-        <w:t xml:space="preserve">Ingest: only the seven supplied URLs are fetchable by scripts/ingest.mjs.</w:t>
-      </w:r>
-    </w:p>
-    <w:p>
-      <w:pPr>
-        <w:pStyle w:val="ListParagraph"/>
-        <w:numPr>
-          <w:ilvl w:val="0"/>
-          <w:numId w:val="2"/>
-        </w:numPr>
-        <w:spacing w:after="90" w:line="280"/>
-      </w:pPr>
-      <w:r>
-        <w:rPr>
-          <w:color w:val="0B2A33"/>
-          <w:sz w:val="20"/>
-          <w:szCs w:val="20"/>
-        </w:rPr>
-        <w:t xml:space="preserve">Review: extracted text is reviewed into concise source records; prices retain currency, duration, and inclusion context.</w:t>
-      </w:r>
-    </w:p>
-    <w:p>
-      <w:pPr>
-        <w:pStyle w:val="ListParagraph"/>
-        <w:numPr>
-          <w:ilvl w:val="0"/>
-          <w:numId w:val="2"/>
-        </w:numPr>
-        <w:spacing w:after="90" w:line="280"/>
-      </w:pPr>
-      <w:r>
-        <w:rPr>
-          <w:color w:val="0B2A33"/>
-          <w:sz w:val="20"/>
-          <w:szCs w:val="20"/>
-        </w:rPr>
-        <w:t xml:space="preserve">Route: high-risk intents are handled before retrieval—medical safety, booking, unsupported premises, and out-of-scope requests.</w:t>
-      </w:r>
-    </w:p>
-    <w:p>
-      <w:pPr>
-        <w:pStyle w:val="ListParagraph"/>
-        <w:numPr>
-          <w:ilvl w:val="0"/>
-          <w:numId w:val="2"/>
-        </w:numPr>
-        <w:spacing w:after="90" w:line="280"/>
-      </w:pPr>
-      <w:r>
-        <w:rPr>
-          <w:color w:val="0B2A33"/>
-          <w:sz w:val="20"/>
-          <w:szCs w:val="20"/>
-        </w:rPr>
-        <w:t xml:space="preserve">Retrieve: explicit intent matches answer price and package questions; weighted keyword matching handles lower-risk questions.</w:t>
-      </w:r>
-    </w:p>
-    <w:p>
-      <w:pPr>
-        <w:pStyle w:val="ListParagraph"/>
-        <w:numPr>
-          <w:ilvl w:val="0"/>
-          <w:numId w:val="2"/>
-        </w:numPr>
-        <w:spacing w:after="90" w:line="280"/>
-      </w:pPr>
-      <w:r>
-        <w:rPr>
-          <w:color w:val="0B2A33"/>
-          <w:sz w:val="20"/>
-          <w:szCs w:val="20"/>
-        </w:rPr>
-        <w:t xml:space="preserve">Answer: factual responses always attach source objects rendered as links in the chat and evidence panel.</w:t>
+        <w:t xml:space="preserve">Ingest: scripts/ingest.mjs fetches only the seven supplied URLs with a clear User-Agent and approximately one request per second.</w:t>
+      </w:r>
+    </w:p>
+    <w:p>
+      <w:pPr>
+        <w:pStyle w:val="ListParagraph"/>
+        <w:numPr>
+          <w:ilvl w:val="0"/>
+          <w:numId w:val="2"/>
+        </w:numPr>
+        <w:spacing w:after="90" w:line="280"/>
+      </w:pPr>
+      <w:r>
+        <w:rPr>
+          <w:color w:val="0B2A33"/>
+          <w:sz w:val="20"/>
+          <w:szCs w:val="20"/>
+        </w:rPr>
+        <w:t xml:space="preserve">Chunk: reviewed facts are stored as 32 auditable chunks with source ID, page title, page type, URL, and exact text.</w:t>
+      </w:r>
+    </w:p>
+    <w:p>
+      <w:pPr>
+        <w:pStyle w:val="ListParagraph"/>
+        <w:numPr>
+          <w:ilvl w:val="0"/>
+          <w:numId w:val="2"/>
+        </w:numPr>
+        <w:spacing w:after="90" w:line="280"/>
+      </w:pPr>
+      <w:r>
+        <w:rPr>
+          <w:color w:val="0B2A33"/>
+          <w:sz w:val="20"/>
+          <w:szCs w:val="20"/>
+        </w:rPr>
+        <w:t xml:space="preserve">Embed: Gemini Embedding 2 creates 768-dimensional document and query vectors.</w:t>
+      </w:r>
+    </w:p>
+    <w:p>
+      <w:pPr>
+        <w:pStyle w:val="ListParagraph"/>
+        <w:numPr>
+          <w:ilvl w:val="0"/>
+          <w:numId w:val="2"/>
+        </w:numPr>
+        <w:spacing w:after="90" w:line="280"/>
+      </w:pPr>
+      <w:r>
+        <w:rPr>
+          <w:color w:val="0B2A33"/>
+          <w:sz w:val="20"/>
+          <w:szCs w:val="20"/>
+        </w:rPr>
+        <w:t xml:space="preserve">Retrieve: normalized vectors are searched with FAISS IndexFlatIP using cosine-equivalent similarity; the top six relevant chunks are considered.</w:t>
+      </w:r>
+    </w:p>
+    <w:p>
+      <w:pPr>
+        <w:pStyle w:val="ListParagraph"/>
+        <w:numPr>
+          <w:ilvl w:val="0"/>
+          <w:numId w:val="2"/>
+        </w:numPr>
+        <w:spacing w:after="90" w:line="280"/>
+      </w:pPr>
+      <w:r>
+        <w:rPr>
+          <w:color w:val="0B2A33"/>
+          <w:sz w:val="20"/>
+          <w:szCs w:val="20"/>
+        </w:rPr>
+        <w:t xml:space="preserve">Generate: Gemini 3.5 Flash-Lite receives only the retrieved evidence, recent chat history, and safety flags, and returns structured JSON with citation IDs.</w:t>
+      </w:r>
+    </w:p>
+    <w:p>
+      <w:pPr>
+        <w:pStyle w:val="ListParagraph"/>
+        <w:numPr>
+          <w:ilvl w:val="0"/>
+          <w:numId w:val="2"/>
+        </w:numPr>
+        <w:spacing w:after="90" w:line="280"/>
+      </w:pPr>
+      <w:r>
+        <w:rPr>
+          <w:color w:val="0B2A33"/>
+          <w:sz w:val="20"/>
+          <w:szCs w:val="20"/>
+        </w:rPr>
+        <w:t xml:space="preserve">Validate: unsupported prices and unsafe medical claims are blocked before the answer reaches the browser.</w:t>
+      </w:r>
+    </w:p>
+    <w:p>
+      <w:pPr>
+        <w:pStyle w:val="ListParagraph"/>
+        <w:numPr>
+          <w:ilvl w:val="0"/>
+          <w:numId w:val="2"/>
+        </w:numPr>
+        <w:spacing w:after="90" w:line="280"/>
+      </w:pPr>
+      <w:r>
+        <w:rPr>
+          <w:color w:val="0B2A33"/>
+          <w:sz w:val="20"/>
+          <w:szCs w:val="20"/>
+        </w:rPr>
+        <w:t xml:space="preserve">Cite: every returned citation retains its chunk ID, supporting excerpt, and original PlacidWay URL for the in-page source popup.</w:t>
       </w:r>
     </w:p>
     <w:p>
@@ -445,7 +513,7 @@
           <w:sz w:val="21"/>
           <w:szCs w:val="21"/>
         </w:rPr>
-        <w:t xml:space="preserve">The live Refresh button reloads the deployed knowledge snapshot without cache. Maintainers run npm run ingest to fetch the allowlisted pages, review the diff, update curated facts, run validation, and redeploy. Human review is intentional for medical and price content.</w:t>
+        <w:t xml:space="preserve">Maintainers run npm run ingest to fetch the allowlisted pages, review the extracted diff, update data/knowledge.json, and rebuild the FAISS index through the protected reindex endpoint or a controlled redeploy. A SHA-256 digest prevents a stale index from being paired with changed knowledge. Human review is intentional for medical and price content.</w:t>
       </w:r>
     </w:p>
     <w:p>
@@ -469,7 +537,7 @@
         </w:rPr>
         <w:t xml:space="preserve">1. </w:t>
       </w:r>
-      <w:hyperlink w:history="1" r:id="rIdg5s1amrj-kcp7xvbrhaye">
+      <w:hyperlink w:history="1" r:id="rIduzsz6qgbdffh3bm3m_uvn">
         <w:r>
           <w:rPr>
             <w:b/>
@@ -493,7 +561,7 @@
         </w:rPr>
         <w:t xml:space="preserve">2. </w:t>
       </w:r>
-      <w:hyperlink w:history="1" r:id="rIdc-t3otarknux5afx8wkon">
+      <w:hyperlink w:history="1" r:id="rIdiorgo8v1koaif5e4x-ujh">
         <w:r>
           <w:rPr>
             <w:b/>
@@ -517,7 +585,7 @@
         </w:rPr>
         <w:t xml:space="preserve">3. </w:t>
       </w:r>
-      <w:hyperlink w:history="1" r:id="rIdp1vsfii87yscgouq5mfsx">
+      <w:hyperlink w:history="1" r:id="rIdhserhlmgzegtmtlxd3jgp">
         <w:r>
           <w:rPr>
             <w:b/>
@@ -541,7 +609,7 @@
         </w:rPr>
         <w:t xml:space="preserve">4. </w:t>
       </w:r>
-      <w:hyperlink w:history="1" r:id="rIdhvj8f4riehitzhgvtuyca">
+      <w:hyperlink w:history="1" r:id="rId6kfhkv5avbpd4sl27vecj">
         <w:r>
           <w:rPr>
             <w:b/>
@@ -565,7 +633,7 @@
         </w:rPr>
         <w:t xml:space="preserve">5. </w:t>
       </w:r>
-      <w:hyperlink w:history="1" r:id="rIds9dbzf1y52bkibpyza7tf">
+      <w:hyperlink w:history="1" r:id="rIdomq-tea1lnzymvl8n1hv8">
         <w:r>
           <w:rPr>
             <w:b/>
@@ -589,7 +657,7 @@
         </w:rPr>
         <w:t xml:space="preserve">6. </w:t>
       </w:r>
-      <w:hyperlink w:history="1" r:id="rIdcf0z5fhcwohrzlh2aehmi">
+      <w:hyperlink w:history="1" r:id="rIdfdos-pgnm1hevsffcvaav">
         <w:r>
           <w:rPr>
             <w:b/>
@@ -613,7 +681,7 @@
         </w:rPr>
         <w:t xml:space="preserve">7. </w:t>
       </w:r>
-      <w:hyperlink w:history="1" r:id="rIdzf6jvo9znuz5e8xton_nk">
+      <w:hyperlink w:history="1" r:id="rIdmd4fnjwqyych8qytpfmch">
         <w:r>
           <w:rPr>
             <w:b/>
@@ -1358,7 +1426,7 @@
         </w:rPr>
         <w:t xml:space="preserve">Evidence: </w:t>
       </w:r>
-      <w:hyperlink w:history="1" r:id="rIdep8sts5z6ype_0nznfflv">
+      <w:hyperlink w:history="1" r:id="rIdac4pjywkqxh_ertwbtukb">
         <w:r>
           <w:rPr>
             <w:b/>
@@ -1407,43 +1475,43 @@
           <w:sz w:val="20"/>
           <w:szCs w:val="20"/>
         </w:rPr>
-        <w:t xml:space="preserve">Deterministic phrasing coverage is narrower than an LLM-based RAG system.</w:t>
-      </w:r>
-    </w:p>
-    <w:p>
-      <w:pPr>
-        <w:pStyle w:val="ListParagraph"/>
-        <w:numPr>
-          <w:ilvl w:val="0"/>
-          <w:numId w:val="2"/>
-        </w:numPr>
-        <w:spacing w:after="90" w:line="280"/>
-      </w:pPr>
-      <w:r>
-        <w:rPr>
-          <w:color w:val="0B2A33"/>
-          <w:sz w:val="20"/>
-          <w:szCs w:val="20"/>
-        </w:rPr>
-        <w:t xml:space="preserve">Multi-turn context is limited to lightweight topic carry-over.</w:t>
-      </w:r>
-    </w:p>
-    <w:p>
-      <w:pPr>
-        <w:pStyle w:val="ListParagraph"/>
-        <w:numPr>
-          <w:ilvl w:val="0"/>
-          <w:numId w:val="2"/>
-        </w:numPr>
-        <w:spacing w:after="90" w:line="280"/>
-      </w:pPr>
-      <w:r>
-        <w:rPr>
-          <w:color w:val="0B2A33"/>
-          <w:sz w:val="20"/>
-          <w:szCs w:val="20"/>
-        </w:rPr>
-        <w:t xml:space="preserve">The source refresh flow requires curator review and redeployment.</w:t>
+        <w:t xml:space="preserve">Curated facts require human review after a source page changes.</w:t>
+      </w:r>
+    </w:p>
+    <w:p>
+      <w:pPr>
+        <w:pStyle w:val="ListParagraph"/>
+        <w:numPr>
+          <w:ilvl w:val="0"/>
+          <w:numId w:val="2"/>
+        </w:numPr>
+        <w:spacing w:after="90" w:line="280"/>
+      </w:pPr>
+      <w:r>
+        <w:rPr>
+          <w:color w:val="0B2A33"/>
+          <w:sz w:val="20"/>
+          <w:szCs w:val="20"/>
+        </w:rPr>
+        <w:t xml:space="preserve">The Gemini free tier has rate limits and may temporarily reject requests at peak usage.</w:t>
+      </w:r>
+    </w:p>
+    <w:p>
+      <w:pPr>
+        <w:pStyle w:val="ListParagraph"/>
+        <w:numPr>
+          <w:ilvl w:val="0"/>
+          <w:numId w:val="2"/>
+        </w:numPr>
+        <w:spacing w:after="90" w:line="280"/>
+      </w:pPr>
+      <w:r>
+        <w:rPr>
+          <w:color w:val="0B2A33"/>
+          <w:sz w:val="20"/>
+          <w:szCs w:val="20"/>
+        </w:rPr>
+        <w:t xml:space="preserve">FAISS is local to each backend instance; a larger multi-instance deployment would need shared index distribution.</w:t>
       </w:r>
     </w:p>
     <w:p>
@@ -1483,7 +1551,7 @@
           <w:sz w:val="21"/>
           <w:szCs w:val="21"/>
         </w:rPr>
-        <w:t xml:space="preserve">I would add a server-side extractor with snapshot diffs, schema validation for price facts, multilingual embeddings for retrieval, automated adversarial tests, and privacy-reviewed aggregate gap logging. I would retain the deterministic safety router in front of any LLM so medical-advice requests, false prices, and unsupported comparisons remain predictable.</w:t>
+        <w:t xml:space="preserve">I would add automated page-extraction diffs, schema validation for price facts, a reranker, multilingual evaluation, prompt-injection tests, and privacy-reviewed centralized gap logging. I would also add a scheduled refresh workflow with human approval before medical or price changes become patient-facing. The deterministic safety checks would remain in front of and behind the LLM.</w:t>
       </w:r>
     </w:p>
     <w:p>
@@ -1510,7 +1578,61 @@
           <w:sz w:val="20"/>
           <w:szCs w:val="20"/>
         </w:rPr>
-        <w:t xml:space="preserve">dist/app.js — intent safety router, retrieval, citations, topic carry-over, and local logging</w:t>
+        <w:t xml:space="preserve">app/main.py — FastAPI chat endpoint, evidence prompt, citation mapping, and response validation</w:t>
+      </w:r>
+    </w:p>
+    <w:p>
+      <w:pPr>
+        <w:pStyle w:val="ListParagraph"/>
+        <w:numPr>
+          <w:ilvl w:val="0"/>
+          <w:numId w:val="2"/>
+        </w:numPr>
+        <w:spacing w:after="90" w:line="280"/>
+      </w:pPr>
+      <w:r>
+        <w:rPr>
+          <w:color w:val="0B2A33"/>
+          <w:sz w:val="20"/>
+          <w:szCs w:val="20"/>
+        </w:rPr>
+        <w:t xml:space="preserve">app/rag.py — Gemini embeddings and FAISS chunk retrieval</w:t>
+      </w:r>
+    </w:p>
+    <w:p>
+      <w:pPr>
+        <w:pStyle w:val="ListParagraph"/>
+        <w:numPr>
+          <w:ilvl w:val="0"/>
+          <w:numId w:val="2"/>
+        </w:numPr>
+        <w:spacing w:after="90" w:line="280"/>
+      </w:pPr>
+      <w:r>
+        <w:rPr>
+          <w:color w:val="0B2A33"/>
+          <w:sz w:val="20"/>
+          <w:szCs w:val="20"/>
+        </w:rPr>
+        <w:t xml:space="preserve">app/safety.py — deterministic medical and price safeguards</w:t>
+      </w:r>
+    </w:p>
+    <w:p>
+      <w:pPr>
+        <w:pStyle w:val="ListParagraph"/>
+        <w:numPr>
+          <w:ilvl w:val="0"/>
+          <w:numId w:val="2"/>
+        </w:numPr>
+        <w:spacing w:after="90" w:line="280"/>
+      </w:pPr>
+      <w:r>
+        <w:rPr>
+          <w:color w:val="0B2A33"/>
+          <w:sz w:val="20"/>
+          <w:szCs w:val="20"/>
+        </w:rPr>
+        <w:t xml:space="preserve">dist/app.js — chat interaction, loading state, chunk citations, and source popup</w:t>
       </w:r>
     </w:p>
     <w:p>
@@ -1584,6 +1706,63 @@
         </w:rPr>
         <w:t xml:space="preserve">README.md and TEST_RESULTS.md — setup, design decisions, limitations, and reproducible results</w:t>
       </w:r>
+    </w:p>
+    <w:p>
+      <w:pPr>
+        <w:pStyle w:val="Heading2"/>
+        <w:spacing w:after="130" w:before="300"/>
+      </w:pPr>
+      <w:r>
+        <w:t xml:space="preserve">Project links</w:t>
+      </w:r>
+    </w:p>
+    <w:p>
+      <w:pPr>
+        <w:spacing w:after="100"/>
+      </w:pPr>
+      <w:r>
+        <w:rPr>
+          <w:b/>
+          <w:bCs/>
+          <w:color w:val="0B2A33"/>
+        </w:rPr>
+        <w:t xml:space="preserve">Live deployment: </w:t>
+      </w:r>
+      <w:hyperlink w:history="1" r:id="rIdyjkh5cuji3gny1ofrpsve">
+        <w:r>
+          <w:rPr>
+            <w:b/>
+            <w:bCs/>
+            <w:color w:val="087C78"/>
+            <w:u w:val="single"/>
+          </w:rPr>
+          <w:t xml:space="preserve">https://placidway-bot.vercel.app</w:t>
+        </w:r>
+      </w:hyperlink>
+    </w:p>
+    <w:p>
+      <w:pPr>
+        <w:spacing w:after="100"/>
+      </w:pPr>
+      <w:r>
+        <w:rPr>
+          <w:b/>
+          <w:bCs/>
+          <w:color w:val="0B2A33"/>
+        </w:rPr>
+        <w:t xml:space="preserve">GitHub repository: </w:t>
+      </w:r>
+      <w:hyperlink w:history="1" r:id="rIdbba2jnrzkhoxovb6mpeza">
+        <w:r>
+          <w:rPr>
+            <w:b/>
+            <w:bCs/>
+            <w:color w:val="087C78"/>
+            <w:u w:val="single"/>
+          </w:rPr>
+          <w:t xml:space="preserve">https://github.com/sunilghanchi/placidway-bot</w:t>
+        </w:r>
+      </w:hyperlink>
     </w:p>
     <w:p>
       <w:pPr>

</xml_diff>